<commit_message>
docs(G3-04): align dependency with G3-03 closure
</commit_message>
<xml_diff>
--- a/docs/deliverables/13-数据库设计说明书.docx
+++ b/docs/deliverables/13-数据库设计说明书.docx
@@ -455,7 +455,7 @@
             <w:fldChar w:fldCharType="begin"/>
           </w:r>
           <w:r>
-            <w:instrText xml:space="preserve"> HYPERLINK \l _Toc21834 </w:instrText>
+            <w:instrText xml:space="preserve"> HYPERLINK \l _Toc832 </w:instrText>
           </w:r>
           <w:r>
             <w:fldChar w:fldCharType="separate"/>
@@ -470,7 +470,7 @@
             <w:fldChar w:fldCharType="begin"/>
           </w:r>
           <w:r>
-            <w:instrText xml:space="preserve"> PAGEREF _Toc21834 \h </w:instrText>
+            <w:instrText xml:space="preserve"> PAGEREF _Toc832 \h </w:instrText>
           </w:r>
           <w:r>
             <w:fldChar w:fldCharType="separate"/>
@@ -504,7 +504,7 @@
               <w:bCs/>
               <w:lang w:val="zh-CN"/>
             </w:rPr>
-            <w:instrText xml:space="preserve"> HYPERLINK \l _Toc14179 </w:instrText>
+            <w:instrText xml:space="preserve"> HYPERLINK \l _Toc22401 </w:instrText>
           </w:r>
           <w:r>
             <w:rPr>
@@ -523,7 +523,7 @@
             <w:fldChar w:fldCharType="begin"/>
           </w:r>
           <w:r>
-            <w:instrText xml:space="preserve"> PAGEREF _Toc14179 \h </w:instrText>
+            <w:instrText xml:space="preserve"> PAGEREF _Toc22401 \h </w:instrText>
           </w:r>
           <w:r>
             <w:fldChar w:fldCharType="separate"/>
@@ -561,7 +561,7 @@
               <w:bCs/>
               <w:lang w:val="zh-CN"/>
             </w:rPr>
-            <w:instrText xml:space="preserve"> HYPERLINK \l _Toc23842 </w:instrText>
+            <w:instrText xml:space="preserve"> HYPERLINK \l _Toc8404 </w:instrText>
           </w:r>
           <w:r>
             <w:rPr>
@@ -580,7 +580,7 @@
             <w:fldChar w:fldCharType="begin"/>
           </w:r>
           <w:r>
-            <w:instrText xml:space="preserve"> PAGEREF _Toc23842 \h </w:instrText>
+            <w:instrText xml:space="preserve"> PAGEREF _Toc8404 \h </w:instrText>
           </w:r>
           <w:r>
             <w:fldChar w:fldCharType="separate"/>
@@ -618,7 +618,7 @@
               <w:bCs/>
               <w:lang w:val="zh-CN"/>
             </w:rPr>
-            <w:instrText xml:space="preserve"> HYPERLINK \l _Toc18931 </w:instrText>
+            <w:instrText xml:space="preserve"> HYPERLINK \l _Toc27784 </w:instrText>
           </w:r>
           <w:r>
             <w:rPr>
@@ -637,7 +637,7 @@
             <w:fldChar w:fldCharType="begin"/>
           </w:r>
           <w:r>
-            <w:instrText xml:space="preserve"> PAGEREF _Toc18931 \h </w:instrText>
+            <w:instrText xml:space="preserve"> PAGEREF _Toc27784 \h </w:instrText>
           </w:r>
           <w:r>
             <w:fldChar w:fldCharType="separate"/>
@@ -675,7 +675,7 @@
               <w:bCs/>
               <w:lang w:val="zh-CN"/>
             </w:rPr>
-            <w:instrText xml:space="preserve"> HYPERLINK \l _Toc25282 </w:instrText>
+            <w:instrText xml:space="preserve"> HYPERLINK \l _Toc25744 </w:instrText>
           </w:r>
           <w:r>
             <w:rPr>
@@ -694,7 +694,7 @@
             <w:fldChar w:fldCharType="begin"/>
           </w:r>
           <w:r>
-            <w:instrText xml:space="preserve"> PAGEREF _Toc25282 \h </w:instrText>
+            <w:instrText xml:space="preserve"> PAGEREF _Toc25744 \h </w:instrText>
           </w:r>
           <w:r>
             <w:fldChar w:fldCharType="separate"/>
@@ -732,7 +732,7 @@
               <w:bCs/>
               <w:lang w:val="zh-CN"/>
             </w:rPr>
-            <w:instrText xml:space="preserve"> HYPERLINK \l _Toc20033 </w:instrText>
+            <w:instrText xml:space="preserve"> HYPERLINK \l _Toc13437 </w:instrText>
           </w:r>
           <w:r>
             <w:rPr>
@@ -751,7 +751,7 @@
             <w:fldChar w:fldCharType="begin"/>
           </w:r>
           <w:r>
-            <w:instrText xml:space="preserve"> PAGEREF _Toc20033 \h </w:instrText>
+            <w:instrText xml:space="preserve"> PAGEREF _Toc13437 \h </w:instrText>
           </w:r>
           <w:r>
             <w:fldChar w:fldCharType="separate"/>
@@ -789,7 +789,7 @@
               <w:bCs/>
               <w:lang w:val="zh-CN"/>
             </w:rPr>
-            <w:instrText xml:space="preserve"> HYPERLINK \l _Toc12015 </w:instrText>
+            <w:instrText xml:space="preserve"> HYPERLINK \l _Toc86 </w:instrText>
           </w:r>
           <w:r>
             <w:rPr>
@@ -808,7 +808,7 @@
             <w:fldChar w:fldCharType="begin"/>
           </w:r>
           <w:r>
-            <w:instrText xml:space="preserve"> PAGEREF _Toc12015 \h </w:instrText>
+            <w:instrText xml:space="preserve"> PAGEREF _Toc86 \h </w:instrText>
           </w:r>
           <w:r>
             <w:fldChar w:fldCharType="separate"/>
@@ -846,7 +846,7 @@
               <w:bCs/>
               <w:lang w:val="zh-CN"/>
             </w:rPr>
-            <w:instrText xml:space="preserve"> HYPERLINK \l _Toc5269 </w:instrText>
+            <w:instrText xml:space="preserve"> HYPERLINK \l _Toc32473 </w:instrText>
           </w:r>
           <w:r>
             <w:rPr>
@@ -865,7 +865,7 @@
             <w:fldChar w:fldCharType="begin"/>
           </w:r>
           <w:r>
-            <w:instrText xml:space="preserve"> PAGEREF _Toc5269 \h </w:instrText>
+            <w:instrText xml:space="preserve"> PAGEREF _Toc32473 \h </w:instrText>
           </w:r>
           <w:r>
             <w:fldChar w:fldCharType="separate"/>
@@ -903,7 +903,7 @@
               <w:bCs/>
               <w:lang w:val="zh-CN"/>
             </w:rPr>
-            <w:instrText xml:space="preserve"> HYPERLINK \l _Toc14594 </w:instrText>
+            <w:instrText xml:space="preserve"> HYPERLINK \l _Toc24149 </w:instrText>
           </w:r>
           <w:r>
             <w:rPr>
@@ -922,7 +922,7 @@
             <w:fldChar w:fldCharType="begin"/>
           </w:r>
           <w:r>
-            <w:instrText xml:space="preserve"> PAGEREF _Toc14594 \h </w:instrText>
+            <w:instrText xml:space="preserve"> PAGEREF _Toc24149 \h </w:instrText>
           </w:r>
           <w:r>
             <w:fldChar w:fldCharType="separate"/>
@@ -960,7 +960,7 @@
               <w:bCs/>
               <w:lang w:val="zh-CN"/>
             </w:rPr>
-            <w:instrText xml:space="preserve"> HYPERLINK \l _Toc17999 </w:instrText>
+            <w:instrText xml:space="preserve"> HYPERLINK \l _Toc27461 </w:instrText>
           </w:r>
           <w:r>
             <w:rPr>
@@ -979,7 +979,7 @@
             <w:fldChar w:fldCharType="begin"/>
           </w:r>
           <w:r>
-            <w:instrText xml:space="preserve"> PAGEREF _Toc17999 \h </w:instrText>
+            <w:instrText xml:space="preserve"> PAGEREF _Toc27461 \h </w:instrText>
           </w:r>
           <w:r>
             <w:fldChar w:fldCharType="separate"/>
@@ -1017,7 +1017,7 @@
               <w:bCs/>
               <w:lang w:val="zh-CN"/>
             </w:rPr>
-            <w:instrText xml:space="preserve"> HYPERLINK \l _Toc32414 </w:instrText>
+            <w:instrText xml:space="preserve"> HYPERLINK \l _Toc19709 </w:instrText>
           </w:r>
           <w:r>
             <w:rPr>
@@ -1036,7 +1036,7 @@
             <w:fldChar w:fldCharType="begin"/>
           </w:r>
           <w:r>
-            <w:instrText xml:space="preserve"> PAGEREF _Toc32414 \h </w:instrText>
+            <w:instrText xml:space="preserve"> PAGEREF _Toc19709 \h </w:instrText>
           </w:r>
           <w:r>
             <w:fldChar w:fldCharType="separate"/>
@@ -1074,7 +1074,7 @@
               <w:bCs/>
               <w:lang w:val="zh-CN"/>
             </w:rPr>
-            <w:instrText xml:space="preserve"> HYPERLINK \l _Toc1342 </w:instrText>
+            <w:instrText xml:space="preserve"> HYPERLINK \l _Toc11822 </w:instrText>
           </w:r>
           <w:r>
             <w:rPr>
@@ -1093,7 +1093,7 @@
             <w:fldChar w:fldCharType="begin"/>
           </w:r>
           <w:r>
-            <w:instrText xml:space="preserve"> PAGEREF _Toc1342 \h </w:instrText>
+            <w:instrText xml:space="preserve"> PAGEREF _Toc11822 \h </w:instrText>
           </w:r>
           <w:r>
             <w:fldChar w:fldCharType="separate"/>
@@ -1131,7 +1131,7 @@
               <w:bCs/>
               <w:lang w:val="zh-CN"/>
             </w:rPr>
-            <w:instrText xml:space="preserve"> HYPERLINK \l _Toc12838 </w:instrText>
+            <w:instrText xml:space="preserve"> HYPERLINK \l _Toc22460 </w:instrText>
           </w:r>
           <w:r>
             <w:rPr>
@@ -1150,7 +1150,7 @@
             <w:fldChar w:fldCharType="begin"/>
           </w:r>
           <w:r>
-            <w:instrText xml:space="preserve"> PAGEREF _Toc12838 \h </w:instrText>
+            <w:instrText xml:space="preserve"> PAGEREF _Toc22460 \h </w:instrText>
           </w:r>
           <w:r>
             <w:fldChar w:fldCharType="separate"/>
@@ -1188,7 +1188,7 @@
               <w:bCs/>
               <w:lang w:val="zh-CN"/>
             </w:rPr>
-            <w:instrText xml:space="preserve"> HYPERLINK \l _Toc15045 </w:instrText>
+            <w:instrText xml:space="preserve"> HYPERLINK \l _Toc4896 </w:instrText>
           </w:r>
           <w:r>
             <w:rPr>
@@ -1207,7 +1207,7 @@
             <w:fldChar w:fldCharType="begin"/>
           </w:r>
           <w:r>
-            <w:instrText xml:space="preserve"> PAGEREF _Toc15045 \h </w:instrText>
+            <w:instrText xml:space="preserve"> PAGEREF _Toc4896 \h </w:instrText>
           </w:r>
           <w:r>
             <w:fldChar w:fldCharType="separate"/>
@@ -1245,7 +1245,7 @@
               <w:bCs/>
               <w:lang w:val="zh-CN"/>
             </w:rPr>
-            <w:instrText xml:space="preserve"> HYPERLINK \l _Toc15829 </w:instrText>
+            <w:instrText xml:space="preserve"> HYPERLINK \l _Toc6781 </w:instrText>
           </w:r>
           <w:r>
             <w:rPr>
@@ -1264,7 +1264,7 @@
             <w:fldChar w:fldCharType="begin"/>
           </w:r>
           <w:r>
-            <w:instrText xml:space="preserve"> PAGEREF _Toc15829 \h </w:instrText>
+            <w:instrText xml:space="preserve"> PAGEREF _Toc6781 \h </w:instrText>
           </w:r>
           <w:r>
             <w:fldChar w:fldCharType="separate"/>
@@ -1302,7 +1302,7 @@
               <w:bCs/>
               <w:lang w:val="zh-CN"/>
             </w:rPr>
-            <w:instrText xml:space="preserve"> HYPERLINK \l _Toc15627 </w:instrText>
+            <w:instrText xml:space="preserve"> HYPERLINK \l _Toc29369 </w:instrText>
           </w:r>
           <w:r>
             <w:rPr>
@@ -1321,7 +1321,7 @@
             <w:fldChar w:fldCharType="begin"/>
           </w:r>
           <w:r>
-            <w:instrText xml:space="preserve"> PAGEREF _Toc15627 \h </w:instrText>
+            <w:instrText xml:space="preserve"> PAGEREF _Toc29369 \h </w:instrText>
           </w:r>
           <w:r>
             <w:fldChar w:fldCharType="separate"/>
@@ -1359,7 +1359,7 @@
               <w:bCs/>
               <w:lang w:val="zh-CN"/>
             </w:rPr>
-            <w:instrText xml:space="preserve"> HYPERLINK \l _Toc18598 </w:instrText>
+            <w:instrText xml:space="preserve"> HYPERLINK \l _Toc3645 </w:instrText>
           </w:r>
           <w:r>
             <w:rPr>
@@ -1378,7 +1378,7 @@
             <w:fldChar w:fldCharType="begin"/>
           </w:r>
           <w:r>
-            <w:instrText xml:space="preserve"> PAGEREF _Toc18598 \h </w:instrText>
+            <w:instrText xml:space="preserve"> PAGEREF _Toc3645 \h </w:instrText>
           </w:r>
           <w:r>
             <w:fldChar w:fldCharType="separate"/>
@@ -1416,7 +1416,7 @@
               <w:bCs/>
               <w:lang w:val="zh-CN"/>
             </w:rPr>
-            <w:instrText xml:space="preserve"> HYPERLINK \l _Toc25290 </w:instrText>
+            <w:instrText xml:space="preserve"> HYPERLINK \l _Toc16756 </w:instrText>
           </w:r>
           <w:r>
             <w:rPr>
@@ -1435,7 +1435,7 @@
             <w:fldChar w:fldCharType="begin"/>
           </w:r>
           <w:r>
-            <w:instrText xml:space="preserve"> PAGEREF _Toc25290 \h </w:instrText>
+            <w:instrText xml:space="preserve"> PAGEREF _Toc16756 \h </w:instrText>
           </w:r>
           <w:r>
             <w:fldChar w:fldCharType="separate"/>
@@ -1473,7 +1473,7 @@
               <w:bCs/>
               <w:lang w:val="zh-CN"/>
             </w:rPr>
-            <w:instrText xml:space="preserve"> HYPERLINK \l _Toc4976 </w:instrText>
+            <w:instrText xml:space="preserve"> HYPERLINK \l _Toc32568 </w:instrText>
           </w:r>
           <w:r>
             <w:rPr>
@@ -1492,7 +1492,7 @@
             <w:fldChar w:fldCharType="begin"/>
           </w:r>
           <w:r>
-            <w:instrText xml:space="preserve"> PAGEREF _Toc4976 \h </w:instrText>
+            <w:instrText xml:space="preserve"> PAGEREF _Toc32568 \h </w:instrText>
           </w:r>
           <w:r>
             <w:fldChar w:fldCharType="separate"/>
@@ -1530,7 +1530,7 @@
               <w:bCs/>
               <w:lang w:val="zh-CN"/>
             </w:rPr>
-            <w:instrText xml:space="preserve"> HYPERLINK \l _Toc8826 </w:instrText>
+            <w:instrText xml:space="preserve"> HYPERLINK \l _Toc17826 </w:instrText>
           </w:r>
           <w:r>
             <w:rPr>
@@ -1549,7 +1549,7 @@
             <w:fldChar w:fldCharType="begin"/>
           </w:r>
           <w:r>
-            <w:instrText xml:space="preserve"> PAGEREF _Toc8826 \h </w:instrText>
+            <w:instrText xml:space="preserve"> PAGEREF _Toc17826 \h </w:instrText>
           </w:r>
           <w:r>
             <w:fldChar w:fldCharType="separate"/>
@@ -1587,7 +1587,7 @@
               <w:bCs/>
               <w:lang w:val="zh-CN"/>
             </w:rPr>
-            <w:instrText xml:space="preserve"> HYPERLINK \l _Toc30683 </w:instrText>
+            <w:instrText xml:space="preserve"> HYPERLINK \l _Toc8563 </w:instrText>
           </w:r>
           <w:r>
             <w:rPr>
@@ -1606,7 +1606,7 @@
             <w:fldChar w:fldCharType="begin"/>
           </w:r>
           <w:r>
-            <w:instrText xml:space="preserve"> PAGEREF _Toc30683 \h </w:instrText>
+            <w:instrText xml:space="preserve"> PAGEREF _Toc8563 \h </w:instrText>
           </w:r>
           <w:r>
             <w:fldChar w:fldCharType="separate"/>
@@ -1644,7 +1644,7 @@
               <w:bCs/>
               <w:lang w:val="zh-CN"/>
             </w:rPr>
-            <w:instrText xml:space="preserve"> HYPERLINK \l _Toc32744 </w:instrText>
+            <w:instrText xml:space="preserve"> HYPERLINK \l _Toc13892 </w:instrText>
           </w:r>
           <w:r>
             <w:rPr>
@@ -1663,7 +1663,7 @@
             <w:fldChar w:fldCharType="begin"/>
           </w:r>
           <w:r>
-            <w:instrText xml:space="preserve"> PAGEREF _Toc32744 \h </w:instrText>
+            <w:instrText xml:space="preserve"> PAGEREF _Toc13892 \h </w:instrText>
           </w:r>
           <w:r>
             <w:fldChar w:fldCharType="separate"/>
@@ -1701,7 +1701,7 @@
               <w:bCs/>
               <w:lang w:val="zh-CN"/>
             </w:rPr>
-            <w:instrText xml:space="preserve"> HYPERLINK \l _Toc24611 </w:instrText>
+            <w:instrText xml:space="preserve"> HYPERLINK \l _Toc7860 </w:instrText>
           </w:r>
           <w:r>
             <w:rPr>
@@ -1720,7 +1720,7 @@
             <w:fldChar w:fldCharType="begin"/>
           </w:r>
           <w:r>
-            <w:instrText xml:space="preserve"> PAGEREF _Toc24611 \h </w:instrText>
+            <w:instrText xml:space="preserve"> PAGEREF _Toc7860 \h </w:instrText>
           </w:r>
           <w:r>
             <w:fldChar w:fldCharType="separate"/>
@@ -1758,7 +1758,7 @@
               <w:bCs/>
               <w:lang w:val="zh-CN"/>
             </w:rPr>
-            <w:instrText xml:space="preserve"> HYPERLINK \l _Toc25468 </w:instrText>
+            <w:instrText xml:space="preserve"> HYPERLINK \l _Toc20905 </w:instrText>
           </w:r>
           <w:r>
             <w:rPr>
@@ -1777,7 +1777,7 @@
             <w:fldChar w:fldCharType="begin"/>
           </w:r>
           <w:r>
-            <w:instrText xml:space="preserve"> PAGEREF _Toc25468 \h </w:instrText>
+            <w:instrText xml:space="preserve"> PAGEREF _Toc20905 \h </w:instrText>
           </w:r>
           <w:r>
             <w:fldChar w:fldCharType="separate"/>
@@ -1815,7 +1815,7 @@
               <w:bCs/>
               <w:lang w:val="zh-CN"/>
             </w:rPr>
-            <w:instrText xml:space="preserve"> HYPERLINK \l _Toc1471 </w:instrText>
+            <w:instrText xml:space="preserve"> HYPERLINK \l _Toc4395 </w:instrText>
           </w:r>
           <w:r>
             <w:rPr>
@@ -1834,7 +1834,7 @@
             <w:fldChar w:fldCharType="begin"/>
           </w:r>
           <w:r>
-            <w:instrText xml:space="preserve"> PAGEREF _Toc1471 \h </w:instrText>
+            <w:instrText xml:space="preserve"> PAGEREF _Toc4395 \h </w:instrText>
           </w:r>
           <w:r>
             <w:fldChar w:fldCharType="separate"/>
@@ -1872,7 +1872,7 @@
               <w:bCs/>
               <w:lang w:val="zh-CN"/>
             </w:rPr>
-            <w:instrText xml:space="preserve"> HYPERLINK \l _Toc4285 </w:instrText>
+            <w:instrText xml:space="preserve"> HYPERLINK \l _Toc12791 </w:instrText>
           </w:r>
           <w:r>
             <w:rPr>
@@ -1891,7 +1891,7 @@
             <w:fldChar w:fldCharType="begin"/>
           </w:r>
           <w:r>
-            <w:instrText xml:space="preserve"> PAGEREF _Toc4285 \h </w:instrText>
+            <w:instrText xml:space="preserve"> PAGEREF _Toc12791 \h </w:instrText>
           </w:r>
           <w:r>
             <w:fldChar w:fldCharType="separate"/>
@@ -1929,7 +1929,7 @@
               <w:bCs/>
               <w:lang w:val="zh-CN"/>
             </w:rPr>
-            <w:instrText xml:space="preserve"> HYPERLINK \l _Toc30305 </w:instrText>
+            <w:instrText xml:space="preserve"> HYPERLINK \l _Toc14413 </w:instrText>
           </w:r>
           <w:r>
             <w:rPr>
@@ -1948,7 +1948,7 @@
             <w:fldChar w:fldCharType="begin"/>
           </w:r>
           <w:r>
-            <w:instrText xml:space="preserve"> PAGEREF _Toc30305 \h </w:instrText>
+            <w:instrText xml:space="preserve"> PAGEREF _Toc14413 \h </w:instrText>
           </w:r>
           <w:r>
             <w:fldChar w:fldCharType="separate"/>
@@ -1986,7 +1986,7 @@
               <w:bCs/>
               <w:lang w:val="zh-CN"/>
             </w:rPr>
-            <w:instrText xml:space="preserve"> HYPERLINK \l _Toc24012 </w:instrText>
+            <w:instrText xml:space="preserve"> HYPERLINK \l _Toc5900 </w:instrText>
           </w:r>
           <w:r>
             <w:rPr>
@@ -2005,7 +2005,7 @@
             <w:fldChar w:fldCharType="begin"/>
           </w:r>
           <w:r>
-            <w:instrText xml:space="preserve"> PAGEREF _Toc24012 \h </w:instrText>
+            <w:instrText xml:space="preserve"> PAGEREF _Toc5900 \h </w:instrText>
           </w:r>
           <w:r>
             <w:fldChar w:fldCharType="separate"/>
@@ -2043,7 +2043,7 @@
               <w:bCs/>
               <w:lang w:val="zh-CN"/>
             </w:rPr>
-            <w:instrText xml:space="preserve"> HYPERLINK \l _Toc6645 </w:instrText>
+            <w:instrText xml:space="preserve"> HYPERLINK \l _Toc25019 </w:instrText>
           </w:r>
           <w:r>
             <w:rPr>
@@ -2062,7 +2062,7 @@
             <w:fldChar w:fldCharType="begin"/>
           </w:r>
           <w:r>
-            <w:instrText xml:space="preserve"> PAGEREF _Toc6645 \h </w:instrText>
+            <w:instrText xml:space="preserve"> PAGEREF _Toc25019 \h </w:instrText>
           </w:r>
           <w:r>
             <w:fldChar w:fldCharType="separate"/>
@@ -2100,7 +2100,7 @@
               <w:bCs/>
               <w:lang w:val="zh-CN"/>
             </w:rPr>
-            <w:instrText xml:space="preserve"> HYPERLINK \l _Toc7155 </w:instrText>
+            <w:instrText xml:space="preserve"> HYPERLINK \l _Toc22619 </w:instrText>
           </w:r>
           <w:r>
             <w:rPr>
@@ -2119,7 +2119,7 @@
             <w:fldChar w:fldCharType="begin"/>
           </w:r>
           <w:r>
-            <w:instrText xml:space="preserve"> PAGEREF _Toc7155 \h </w:instrText>
+            <w:instrText xml:space="preserve"> PAGEREF _Toc22619 \h </w:instrText>
           </w:r>
           <w:r>
             <w:fldChar w:fldCharType="separate"/>
@@ -2157,7 +2157,7 @@
               <w:bCs/>
               <w:lang w:val="zh-CN"/>
             </w:rPr>
-            <w:instrText xml:space="preserve"> HYPERLINK \l _Toc2429 </w:instrText>
+            <w:instrText xml:space="preserve"> HYPERLINK \l _Toc3623 </w:instrText>
           </w:r>
           <w:r>
             <w:rPr>
@@ -2176,7 +2176,7 @@
             <w:fldChar w:fldCharType="begin"/>
           </w:r>
           <w:r>
-            <w:instrText xml:space="preserve"> PAGEREF _Toc2429 \h </w:instrText>
+            <w:instrText xml:space="preserve"> PAGEREF _Toc3623 \h </w:instrText>
           </w:r>
           <w:r>
             <w:fldChar w:fldCharType="separate"/>
@@ -2214,7 +2214,7 @@
               <w:bCs/>
               <w:lang w:val="zh-CN"/>
             </w:rPr>
-            <w:instrText xml:space="preserve"> HYPERLINK \l _Toc24958 </w:instrText>
+            <w:instrText xml:space="preserve"> HYPERLINK \l _Toc1707 </w:instrText>
           </w:r>
           <w:r>
             <w:rPr>
@@ -2233,7 +2233,7 @@
             <w:fldChar w:fldCharType="begin"/>
           </w:r>
           <w:r>
-            <w:instrText xml:space="preserve"> PAGEREF _Toc24958 \h </w:instrText>
+            <w:instrText xml:space="preserve"> PAGEREF _Toc1707 \h </w:instrText>
           </w:r>
           <w:r>
             <w:fldChar w:fldCharType="separate"/>
@@ -2271,7 +2271,7 @@
               <w:bCs/>
               <w:lang w:val="zh-CN"/>
             </w:rPr>
-            <w:instrText xml:space="preserve"> HYPERLINK \l _Toc17929 </w:instrText>
+            <w:instrText xml:space="preserve"> HYPERLINK \l _Toc23189 </w:instrText>
           </w:r>
           <w:r>
             <w:rPr>
@@ -2290,7 +2290,7 @@
             <w:fldChar w:fldCharType="begin"/>
           </w:r>
           <w:r>
-            <w:instrText xml:space="preserve"> PAGEREF _Toc17929 \h </w:instrText>
+            <w:instrText xml:space="preserve"> PAGEREF _Toc23189 \h </w:instrText>
           </w:r>
           <w:r>
             <w:fldChar w:fldCharType="separate"/>
@@ -2328,7 +2328,7 @@
               <w:bCs/>
               <w:lang w:val="zh-CN"/>
             </w:rPr>
-            <w:instrText xml:space="preserve"> HYPERLINK \l _Toc10098 </w:instrText>
+            <w:instrText xml:space="preserve"> HYPERLINK \l _Toc17641 </w:instrText>
           </w:r>
           <w:r>
             <w:rPr>
@@ -2347,7 +2347,7 @@
             <w:fldChar w:fldCharType="begin"/>
           </w:r>
           <w:r>
-            <w:instrText xml:space="preserve"> PAGEREF _Toc10098 \h </w:instrText>
+            <w:instrText xml:space="preserve"> PAGEREF _Toc17641 \h </w:instrText>
           </w:r>
           <w:r>
             <w:fldChar w:fldCharType="separate"/>
@@ -2385,7 +2385,7 @@
               <w:bCs/>
               <w:lang w:val="zh-CN"/>
             </w:rPr>
-            <w:instrText xml:space="preserve"> HYPERLINK \l _Toc6160 </w:instrText>
+            <w:instrText xml:space="preserve"> HYPERLINK \l _Toc14439 </w:instrText>
           </w:r>
           <w:r>
             <w:rPr>
@@ -2404,7 +2404,7 @@
             <w:fldChar w:fldCharType="begin"/>
           </w:r>
           <w:r>
-            <w:instrText xml:space="preserve"> PAGEREF _Toc6160 \h </w:instrText>
+            <w:instrText xml:space="preserve"> PAGEREF _Toc14439 \h </w:instrText>
           </w:r>
           <w:r>
             <w:fldChar w:fldCharType="separate"/>
@@ -2442,7 +2442,7 @@
               <w:bCs/>
               <w:lang w:val="zh-CN"/>
             </w:rPr>
-            <w:instrText xml:space="preserve"> HYPERLINK \l _Toc475 </w:instrText>
+            <w:instrText xml:space="preserve"> HYPERLINK \l _Toc22634 </w:instrText>
           </w:r>
           <w:r>
             <w:rPr>
@@ -2461,7 +2461,7 @@
             <w:fldChar w:fldCharType="begin"/>
           </w:r>
           <w:r>
-            <w:instrText xml:space="preserve"> PAGEREF _Toc475 \h </w:instrText>
+            <w:instrText xml:space="preserve"> PAGEREF _Toc22634 \h </w:instrText>
           </w:r>
           <w:r>
             <w:fldChar w:fldCharType="separate"/>
@@ -2507,7 +2507,7 @@
       <w:pPr>
         <w:pStyle w:val="2"/>
       </w:pPr>
-      <w:bookmarkStart w:id="0" w:name="_Toc21834"/>
+      <w:bookmarkStart w:id="0" w:name="_Toc832"/>
       <w:r>
         <w:t>1 引言</w:t>
       </w:r>
@@ -2517,7 +2517,7 @@
       <w:pPr>
         <w:pStyle w:val="3"/>
       </w:pPr>
-      <w:bookmarkStart w:id="1" w:name="_Toc14179"/>
+      <w:bookmarkStart w:id="1" w:name="_Toc22401"/>
       <w:r>
         <w:t>1.1 编写目的</w:t>
       </w:r>
@@ -2537,7 +2537,7 @@
       <w:pPr>
         <w:pStyle w:val="3"/>
       </w:pPr>
-      <w:bookmarkStart w:id="2" w:name="_Toc23842"/>
+      <w:bookmarkStart w:id="2" w:name="_Toc8404"/>
       <w:r>
         <w:t>1.2 范围和非目标</w:t>
       </w:r>
@@ -2552,7 +2552,7 @@
       <w:pPr>
         <w:pStyle w:val="3"/>
       </w:pPr>
-      <w:bookmarkStart w:id="3" w:name="_Toc18931"/>
+      <w:bookmarkStart w:id="3" w:name="_Toc27784"/>
       <w:r>
         <w:t>1.3 设计状态和约束</w:t>
       </w:r>
@@ -2560,7 +2560,7 @@
     </w:p>
     <w:p>
       <w:r>
-        <w:t>G3-03 当前仍为 REVIEW，本文按其最新候选中的单一写入主责、端口隔离和可重建态势投影设计；若 G3-03 复核导致架构边界变化，应通过变更单评估本稿。</w:t>
+        <w:t>G3-03 已完成 C 最终复核并置为 DONE，本文按其已准出版本中的单一写入主责、端口隔离和可重建态势投影设计；后续如架构边界发生变化，应通过变更单评估本稿。</w:t>
       </w:r>
       <w:r>
         <w:rPr>
@@ -2577,7 +2577,7 @@
       <w:pPr>
         <w:pStyle w:val="2"/>
       </w:pPr>
-      <w:bookmarkStart w:id="4" w:name="_Toc25282"/>
+      <w:bookmarkStart w:id="4" w:name="_Toc25744"/>
       <w:r>
         <w:t>2 数据设计原则与资产总览</w:t>
       </w:r>
@@ -2587,7 +2587,7 @@
       <w:pPr>
         <w:pStyle w:val="3"/>
       </w:pPr>
-      <w:bookmarkStart w:id="5" w:name="_Toc20033"/>
+      <w:bookmarkStart w:id="5" w:name="_Toc13437"/>
       <w:r>
         <w:t>2.1 设计原则</w:t>
       </w:r>
@@ -2716,7 +2716,7 @@
       <w:pPr>
         <w:pStyle w:val="3"/>
       </w:pPr>
-      <w:bookmarkStart w:id="6" w:name="_Toc12015"/>
+      <w:bookmarkStart w:id="6" w:name="_Toc86"/>
       <w:r>
         <w:t>2.2 数据资产清单</w:t>
       </w:r>
@@ -4369,7 +4369,7 @@
       <w:pPr>
         <w:pStyle w:val="2"/>
       </w:pPr>
-      <w:bookmarkStart w:id="7" w:name="_Toc5269"/>
+      <w:bookmarkStart w:id="7" w:name="_Toc32473"/>
       <w:r>
         <w:t>3 概念数据模型</w:t>
       </w:r>
@@ -4379,7 +4379,7 @@
       <w:pPr>
         <w:pStyle w:val="3"/>
       </w:pPr>
-      <w:bookmarkStart w:id="8" w:name="_Toc14594"/>
+      <w:bookmarkStart w:id="8" w:name="_Toc24149"/>
       <w:r>
         <w:t>3.1 核心数据域关系</w:t>
       </w:r>
@@ -4456,7 +4456,7 @@
       <w:pPr>
         <w:pStyle w:val="3"/>
       </w:pPr>
-      <w:bookmarkStart w:id="9" w:name="_Toc17999"/>
+      <w:bookmarkStart w:id="9" w:name="_Toc27461"/>
       <w:r>
         <w:t>3.2 关键关系和基数</w:t>
       </w:r>
@@ -5827,7 +5827,7 @@
       <w:pPr>
         <w:pStyle w:val="2"/>
       </w:pPr>
-      <w:bookmarkStart w:id="10" w:name="_Toc32414"/>
+      <w:bookmarkStart w:id="10" w:name="_Toc19709"/>
       <w:r>
         <w:t>4 逻辑数据模型</w:t>
       </w:r>
@@ -5837,7 +5837,7 @@
       <w:pPr>
         <w:pStyle w:val="3"/>
       </w:pPr>
-      <w:bookmarkStart w:id="11" w:name="_Toc1342"/>
+      <w:bookmarkStart w:id="11" w:name="_Toc11822"/>
       <w:r>
         <w:t>4.1 通用字段约定</w:t>
       </w:r>
@@ -7208,7 +7208,7 @@
       <w:pPr>
         <w:pStyle w:val="3"/>
       </w:pPr>
-      <w:bookmarkStart w:id="12" w:name="_Toc12838"/>
+      <w:bookmarkStart w:id="12" w:name="_Toc22460"/>
       <w:r>
         <w:t>4.2 预案域</w:t>
       </w:r>
@@ -8217,7 +8217,7 @@
       <w:pPr>
         <w:pStyle w:val="3"/>
       </w:pPr>
-      <w:bookmarkStart w:id="13" w:name="_Toc15045"/>
+      <w:bookmarkStart w:id="13" w:name="_Toc4896"/>
       <w:r>
         <w:t>4.3 事件与任务域</w:t>
       </w:r>
@@ -9348,7 +9348,7 @@
       <w:pPr>
         <w:pStyle w:val="3"/>
       </w:pPr>
-      <w:bookmarkStart w:id="14" w:name="_Toc15829"/>
+      <w:bookmarkStart w:id="14" w:name="_Toc6781"/>
       <w:r>
         <w:t>4.4 人员、定位和物资域</w:t>
       </w:r>
@@ -10719,7 +10719,7 @@
       <w:pPr>
         <w:pStyle w:val="3"/>
       </w:pPr>
-      <w:bookmarkStart w:id="15" w:name="_Toc15627"/>
+      <w:bookmarkStart w:id="15" w:name="_Toc29369"/>
       <w:r>
         <w:t>4.5 值班、打卡、演练和知识域</w:t>
       </w:r>
@@ -12208,7 +12208,7 @@
       <w:pPr>
         <w:pStyle w:val="3"/>
       </w:pPr>
-      <w:bookmarkStart w:id="16" w:name="_Toc18598"/>
+      <w:bookmarkStart w:id="16" w:name="_Toc3645"/>
       <w:r>
         <w:t>4.6 集成、审计和投影域</w:t>
       </w:r>
@@ -13217,7 +13217,7 @@
       <w:pPr>
         <w:pStyle w:val="2"/>
       </w:pPr>
-      <w:bookmarkStart w:id="17" w:name="_Toc25290"/>
+      <w:bookmarkStart w:id="17" w:name="_Toc16756"/>
       <w:r>
         <w:t>5 物理数据库设计</w:t>
       </w:r>
@@ -13227,7 +13227,7 @@
       <w:pPr>
         <w:pStyle w:val="3"/>
       </w:pPr>
-      <w:bookmarkStart w:id="18" w:name="_Toc4976"/>
+      <w:bookmarkStart w:id="18" w:name="_Toc32568"/>
       <w:r>
         <w:t>5.1 数据库产品与命名</w:t>
       </w:r>
@@ -13257,7 +13257,7 @@
       <w:pPr>
         <w:pStyle w:val="3"/>
       </w:pPr>
-      <w:bookmarkStart w:id="19" w:name="_Toc8826"/>
+      <w:bookmarkStart w:id="19" w:name="_Toc17826"/>
       <w:r>
         <w:t>5.2 逻辑类型到物理类型映射</w:t>
       </w:r>
@@ -14157,7 +14157,7 @@
       <w:pPr>
         <w:pStyle w:val="3"/>
       </w:pPr>
-      <w:bookmarkStart w:id="20" w:name="_Toc30683"/>
+      <w:bookmarkStart w:id="20" w:name="_Toc8563"/>
       <w:r>
         <w:t>5.3 主键、外键和删除策略</w:t>
       </w:r>
@@ -14182,7 +14182,7 @@
       <w:pPr>
         <w:pStyle w:val="3"/>
       </w:pPr>
-      <w:bookmarkStart w:id="21" w:name="_Toc32744"/>
+      <w:bookmarkStart w:id="21" w:name="_Toc13892"/>
       <w:r>
         <w:t>5.4 索引设计</w:t>
       </w:r>
@@ -15798,7 +15798,7 @@
       <w:pPr>
         <w:pStyle w:val="3"/>
       </w:pPr>
-      <w:bookmarkStart w:id="22" w:name="_Toc24611"/>
+      <w:bookmarkStart w:id="22" w:name="_Toc7860"/>
       <w:r>
         <w:t>5.5 事务与并发</w:t>
       </w:r>
@@ -15858,7 +15858,7 @@
       <w:pPr>
         <w:pStyle w:val="2"/>
       </w:pPr>
-      <w:bookmarkStart w:id="23" w:name="_Toc25468"/>
+      <w:bookmarkStart w:id="23" w:name="_Toc20905"/>
       <w:r>
         <w:t>6 完整性、一致性与安全策略</w:t>
       </w:r>
@@ -15868,7 +15868,7 @@
       <w:pPr>
         <w:pStyle w:val="3"/>
       </w:pPr>
-      <w:bookmarkStart w:id="24" w:name="_Toc1471"/>
+      <w:bookmarkStart w:id="24" w:name="_Toc4395"/>
       <w:r>
         <w:t>6.1 数据完整性</w:t>
       </w:r>
@@ -15883,7 +15883,7 @@
       <w:pPr>
         <w:pStyle w:val="3"/>
       </w:pPr>
-      <w:bookmarkStart w:id="25" w:name="_Toc4285"/>
+      <w:bookmarkStart w:id="25" w:name="_Toc12791"/>
       <w:r>
         <w:t>6.2 十项澄清的数据落点</w:t>
       </w:r>
@@ -16972,7 +16972,7 @@
       <w:pPr>
         <w:pStyle w:val="3"/>
       </w:pPr>
-      <w:bookmarkStart w:id="26" w:name="_Toc30305"/>
+      <w:bookmarkStart w:id="26" w:name="_Toc14413"/>
       <w:r>
         <w:t>6.3 安全与审计</w:t>
       </w:r>
@@ -16992,7 +16992,7 @@
       <w:pPr>
         <w:pStyle w:val="2"/>
       </w:pPr>
-      <w:bookmarkStart w:id="27" w:name="_Toc24012"/>
+      <w:bookmarkStart w:id="27" w:name="_Toc5900"/>
       <w:r>
         <w:t>7 容量、保存、备份和演进</w:t>
       </w:r>
@@ -17002,7 +17002,7 @@
       <w:pPr>
         <w:pStyle w:val="3"/>
       </w:pPr>
-      <w:bookmarkStart w:id="28" w:name="_Toc6645"/>
+      <w:bookmarkStart w:id="28" w:name="_Toc25019"/>
       <w:r>
         <w:t>7.1 容量基线</w:t>
       </w:r>
@@ -17811,7 +17811,7 @@
       <w:pPr>
         <w:pStyle w:val="3"/>
       </w:pPr>
-      <w:bookmarkStart w:id="29" w:name="_Toc7155"/>
+      <w:bookmarkStart w:id="29" w:name="_Toc22619"/>
       <w:r>
         <w:t>7.2 保存与归档</w:t>
       </w:r>
@@ -17826,7 +17826,7 @@
       <w:pPr>
         <w:pStyle w:val="3"/>
       </w:pPr>
-      <w:bookmarkStart w:id="30" w:name="_Toc2429"/>
+      <w:bookmarkStart w:id="30" w:name="_Toc3623"/>
       <w:r>
         <w:t>7.3 备份与恢复</w:t>
       </w:r>
@@ -17841,7 +17841,7 @@
       <w:pPr>
         <w:pStyle w:val="3"/>
       </w:pPr>
-      <w:bookmarkStart w:id="31" w:name="_Toc24958"/>
+      <w:bookmarkStart w:id="31" w:name="_Toc1707"/>
       <w:r>
         <w:t>7.4 初始化、迁移和演进</w:t>
       </w:r>
@@ -17861,7 +17861,7 @@
       <w:pPr>
         <w:pStyle w:val="2"/>
       </w:pPr>
-      <w:bookmarkStart w:id="32" w:name="_Toc17929"/>
+      <w:bookmarkStart w:id="32" w:name="_Toc23189"/>
       <w:r>
         <w:t>8 追踪、验证与未决事项</w:t>
       </w:r>
@@ -17871,7 +17871,7 @@
       <w:pPr>
         <w:pStyle w:val="3"/>
       </w:pPr>
-      <w:bookmarkStart w:id="33" w:name="_Toc10098"/>
+      <w:bookmarkStart w:id="33" w:name="_Toc17641"/>
       <w:r>
         <w:t>8.1 设计验证矩阵</w:t>
       </w:r>
@@ -19242,7 +19242,7 @@
       <w:pPr>
         <w:pStyle w:val="3"/>
       </w:pPr>
-      <w:bookmarkStart w:id="34" w:name="_Toc6160"/>
+      <w:bookmarkStart w:id="34" w:name="_Toc14439"/>
       <w:r>
         <w:t>8.2 未决事项和阻断关系</w:t>
       </w:r>
@@ -19513,7 +19513,7 @@
                 <w:b w:val="0"/>
                 <w:sz w:val="21"/>
               </w:rPr>
-              <w:t>G3-03 尚待 C 复核</w:t>
+              <w:t>G3-03 已完成 C 最终复核</w:t>
             </w:r>
           </w:p>
         </w:tc>
@@ -19539,7 +19539,7 @@
                 <w:b w:val="0"/>
                 <w:sz w:val="21"/>
               </w:rPr>
-              <w:t>使用最新候选并记录版本依赖</w:t>
+              <w:t>使用已准出版本并记录依赖</w:t>
             </w:r>
           </w:p>
         </w:tc>
@@ -19565,7 +19565,7 @@
                 <w:b w:val="0"/>
                 <w:sz w:val="21"/>
               </w:rPr>
-              <w:t>若架构边界变化，G3-04 必须变更评估</w:t>
+              <w:t>当前无阻断；后续架构边界变化须执行变更评估</w:t>
             </w:r>
           </w:p>
         </w:tc>
@@ -19857,7 +19857,7 @@
       <w:pPr>
         <w:pStyle w:val="3"/>
       </w:pPr>
-      <w:bookmarkStart w:id="35" w:name="_Toc475"/>
+      <w:bookmarkStart w:id="35" w:name="_Toc22634"/>
       <w:r>
         <w:t>8.3 自检结论</w:t>
       </w:r>
@@ -19959,7 +19959,7 @@
     <w:lsdException w:uiPriority="99" w:name="index 7"/>
     <w:lsdException w:uiPriority="99" w:name="index 8"/>
     <w:lsdException w:uiPriority="99" w:name="index 9"/>
-    <w:lsdException w:uiPriority="39" w:semiHidden="0" w:name="toc 1"/>
+    <w:lsdException w:qFormat="1" w:uiPriority="39" w:semiHidden="0" w:name="toc 1"/>
     <w:lsdException w:uiPriority="39" w:semiHidden="0" w:name="toc 2"/>
     <w:lsdException w:uiPriority="39" w:name="toc 3"/>
     <w:lsdException w:uiPriority="39" w:name="toc 4"/>
@@ -19969,7 +19969,7 @@
     <w:lsdException w:uiPriority="39" w:name="toc 8"/>
     <w:lsdException w:uiPriority="39" w:name="toc 9"/>
     <w:lsdException w:uiPriority="99" w:name="Normal Indent"/>
-    <w:lsdException w:uiPriority="99" w:name="footnote text"/>
+    <w:lsdException w:qFormat="1" w:uiPriority="99" w:name="footnote text"/>
     <w:lsdException w:uiPriority="99" w:name="annotation text"/>
     <w:lsdException w:uiPriority="99" w:semiHidden="0" w:name="header"/>
     <w:lsdException w:uiPriority="99" w:semiHidden="0" w:name="footer"/>
@@ -19978,12 +19978,12 @@
     <w:lsdException w:uiPriority="99" w:name="table of figures"/>
     <w:lsdException w:uiPriority="99" w:name="envelope address"/>
     <w:lsdException w:uiPriority="99" w:name="envelope return"/>
-    <w:lsdException w:uiPriority="99" w:name="footnote reference"/>
+    <w:lsdException w:qFormat="1" w:uiPriority="99" w:name="footnote reference"/>
     <w:lsdException w:uiPriority="99" w:name="annotation reference"/>
     <w:lsdException w:uiPriority="99" w:name="line number"/>
     <w:lsdException w:uiPriority="99" w:name="page number"/>
     <w:lsdException w:uiPriority="99" w:name="endnote reference"/>
-    <w:lsdException w:uiPriority="99" w:name="endnote text"/>
+    <w:lsdException w:qFormat="1" w:uiPriority="99" w:name="endnote text"/>
     <w:lsdException w:uiPriority="99" w:name="table of authorities"/>
     <w:lsdException w:uiPriority="99" w:name="macro"/>
     <w:lsdException w:uiPriority="99" w:name="toa heading"/>
@@ -20005,7 +20005,7 @@
     <w:lsdException w:qFormat="1" w:unhideWhenUsed="0" w:uiPriority="10" w:semiHidden="0" w:name="Title"/>
     <w:lsdException w:uiPriority="99" w:name="Closing"/>
     <w:lsdException w:uiPriority="99" w:name="Signature"/>
-    <w:lsdException w:uiPriority="1" w:name="Default Paragraph Font"/>
+    <w:lsdException w:qFormat="1" w:uiPriority="1" w:name="Default Paragraph Font"/>
     <w:lsdException w:uiPriority="99" w:name="Body Text"/>
     <w:lsdException w:uiPriority="99" w:name="Body Text Indent"/>
     <w:lsdException w:uiPriority="99" w:name="List Continue"/>
@@ -20043,7 +20043,7 @@
     <w:lsdException w:uiPriority="99" w:name="HTML Sample"/>
     <w:lsdException w:uiPriority="99" w:name="HTML Typewriter"/>
     <w:lsdException w:uiPriority="99" w:name="HTML Variable"/>
-    <w:lsdException w:uiPriority="99" w:name="Normal Table"/>
+    <w:lsdException w:qFormat="1" w:uiPriority="99" w:name="Normal Table"/>
     <w:lsdException w:uiPriority="99" w:name="annotation subject"/>
     <w:lsdException w:uiPriority="99" w:name="Table Simple 1"/>
     <w:lsdException w:uiPriority="99" w:name="Table Simple 2"/>
@@ -20302,12 +20302,14 @@
     <w:name w:val="Default Paragraph Font"/>
     <w:semiHidden/>
     <w:unhideWhenUsed/>
+    <w:qFormat/>
     <w:uiPriority w:val="1"/>
   </w:style>
   <w:style w:type="table" w:default="1" w:styleId="15">
     <w:name w:val="Normal Table"/>
     <w:semiHidden/>
     <w:unhideWhenUsed/>
+    <w:qFormat/>
     <w:uiPriority w:val="99"/>
     <w:tblPr>
       <w:tblCellMar>
@@ -20323,6 +20325,7 @@
     <w:link w:val="23"/>
     <w:semiHidden/>
     <w:unhideWhenUsed/>
+    <w:qFormat/>
     <w:uiPriority w:val="99"/>
     <w:rPr>
       <w:rFonts w:ascii="Times New Roman" w:hAnsi="Times New Roman" w:cs="Times New Roman" w:eastAsiaTheme="minorEastAsia"/>
@@ -20377,6 +20380,7 @@
     <w:next w:val="1"/>
     <w:autoRedefine/>
     <w:unhideWhenUsed/>
+    <w:qFormat/>
     <w:uiPriority w:val="39"/>
   </w:style>
   <w:style w:type="paragraph" w:styleId="12">
@@ -20384,6 +20388,7 @@
     <w:link w:val="22"/>
     <w:semiHidden/>
     <w:unhideWhenUsed/>
+    <w:qFormat/>
     <w:uiPriority w:val="99"/>
     <w:rPr>
       <w:rFonts w:ascii="Times New Roman" w:hAnsi="Times New Roman" w:cs="Times New Roman" w:eastAsiaTheme="minorEastAsia"/>
@@ -20437,6 +20442,7 @@
     <w:name w:val="footnote reference"/>
     <w:semiHidden/>
     <w:unhideWhenUsed/>
+    <w:qFormat/>
     <w:uiPriority w:val="99"/>
     <w:rPr>
       <w:color w:val="000000"/>
@@ -20482,6 +20488,7 @@
     <w:link w:val="8"/>
     <w:semiHidden/>
     <w:unhideWhenUsed/>
+    <w:qFormat/>
     <w:uiPriority w:val="99"/>
     <w:rPr>
       <w:color w:val="000000"/>
@@ -20503,6 +20510,7 @@
     <w:name w:val="页脚 字符"/>
     <w:basedOn w:val="16"/>
     <w:link w:val="9"/>
+    <w:qFormat/>
     <w:uiPriority w:val="99"/>
     <w:rPr>
       <w:sz w:val="18"/>

</xml_diff>